<commit_message>
Ship the app in a folder named ReverseBid, with a START HERE file
The zip unpacked to a folder called 'ra' one level below where the guides
said to look, so the launchers were easy to miss. The archive now carries a
top-level ReverseBid folder with everything directly inside it, plus a plain
START HERE.txt naming the two files to double-click. Both guides updated to
match, including a 'cannot see those files?' note pointing at README.md as
the marker of the right folder.

Co-Authored-By: Claude Opus 5 <noreply@anthropic.com>
Claude-Session: https://claude.ai/code/session_01W6biHijYkKue3m5SJHQaQ3
</commit_message>
<xml_diff>
--- a/docs/1 - Running ReverseBid on Windows.docx
+++ b/docs/1 - Running ReverseBid on Windows.docx
@@ -921,18 +921,27 @@
           <w:sz w:val="22"/>
           <w:szCs w:val="22"/>
         </w:rPr>
-        <w:t xml:space="preserve">A box appears asking where to put it. Delete what is in the box and type exactly: </w:t>
-      </w:r>
-      <w:r>
-        <w:rPr>
-          <w:rFonts w:ascii="Georgia" w:cs="Georgia" w:eastAsia="Georgia" w:hAnsi="Georgia"/>
-          <w:b/>
-          <w:bCs/>
-          <w:color w:val="1A2321"/>
-          <w:sz w:val="22"/>
-          <w:szCs w:val="22"/>
-        </w:rPr>
-        <w:t xml:space="preserve">C:\ReverseBid</w:t>
+        <w:t xml:space="preserve">A box appears asking where to put it. Delete everything in that box and type exactly </w:t>
+      </w:r>
+      <w:r>
+        <w:rPr>
+          <w:rFonts w:ascii="Georgia" w:cs="Georgia" w:eastAsia="Georgia" w:hAnsi="Georgia"/>
+          <w:b/>
+          <w:bCs/>
+          <w:color w:val="1A2321"/>
+          <w:sz w:val="22"/>
+          <w:szCs w:val="22"/>
+        </w:rPr>
+        <w:t xml:space="preserve">C:\</w:t>
+      </w:r>
+      <w:r>
+        <w:rPr>
+          <w:rFonts w:ascii="Georgia" w:cs="Georgia" w:eastAsia="Georgia" w:hAnsi="Georgia"/>
+          <w:color w:val="1A2321"/>
+          <w:sz w:val="22"/>
+          <w:szCs w:val="22"/>
+        </w:rPr>
+        <w:t xml:space="preserve"> — just those three characters.</w:t>
       </w:r>
     </w:p>
     <w:p>
@@ -971,7 +980,7 @@
           <w:sz w:val="22"/>
           <w:szCs w:val="22"/>
         </w:rPr>
-        <w:t xml:space="preserve">. A window opens showing the extracted contents.</w:t>
+        <w:t xml:space="preserve">.</w:t>
       </w:r>
     </w:p>
     <w:p>
@@ -990,27 +999,67 @@
           <w:sz w:val="22"/>
           <w:szCs w:val="22"/>
         </w:rPr>
-        <w:t xml:space="preserve">Inside it there is a single folder called </w:t>
-      </w:r>
-      <w:r>
-        <w:rPr>
-          <w:rFonts w:ascii="Georgia" w:cs="Georgia" w:eastAsia="Georgia" w:hAnsi="Georgia"/>
-          <w:b/>
-          <w:bCs/>
-          <w:color w:val="1A2321"/>
-          <w:sz w:val="22"/>
-          <w:szCs w:val="22"/>
-        </w:rPr>
-        <w:t xml:space="preserve">ra</w:t>
-      </w:r>
-      <w:r>
-        <w:rPr>
-          <w:rFonts w:ascii="Georgia" w:cs="Georgia" w:eastAsia="Georgia" w:hAnsi="Georgia"/>
-          <w:color w:val="1A2321"/>
-          <w:sz w:val="22"/>
-          <w:szCs w:val="22"/>
-        </w:rPr>
-        <w:t xml:space="preserve">. Double-click to open it. This folder is the app.</w:t>
+        <w:t xml:space="preserve">Open </w:t>
+      </w:r>
+      <w:r>
+        <w:rPr>
+          <w:rFonts w:ascii="Georgia" w:cs="Georgia" w:eastAsia="Georgia" w:hAnsi="Georgia"/>
+          <w:b/>
+          <w:bCs/>
+          <w:color w:val="1A2321"/>
+          <w:sz w:val="22"/>
+          <w:szCs w:val="22"/>
+        </w:rPr>
+        <w:t xml:space="preserve">This PC</w:t>
+      </w:r>
+      <w:r>
+        <w:rPr>
+          <w:rFonts w:ascii="Georgia" w:cs="Georgia" w:eastAsia="Georgia" w:hAnsi="Georgia"/>
+          <w:color w:val="1A2321"/>
+          <w:sz w:val="22"/>
+          <w:szCs w:val="22"/>
+        </w:rPr>
+        <w:t xml:space="preserve">, then </w:t>
+      </w:r>
+      <w:r>
+        <w:rPr>
+          <w:rFonts w:ascii="Georgia" w:cs="Georgia" w:eastAsia="Georgia" w:hAnsi="Georgia"/>
+          <w:b/>
+          <w:bCs/>
+          <w:color w:val="1A2321"/>
+          <w:sz w:val="22"/>
+          <w:szCs w:val="22"/>
+        </w:rPr>
+        <w:t xml:space="preserve">Local Disk (C:)</w:t>
+      </w:r>
+      <w:r>
+        <w:rPr>
+          <w:rFonts w:ascii="Georgia" w:cs="Georgia" w:eastAsia="Georgia" w:hAnsi="Georgia"/>
+          <w:color w:val="1A2321"/>
+          <w:sz w:val="22"/>
+          <w:szCs w:val="22"/>
+        </w:rPr>
+        <w:t xml:space="preserve">, then the folder called </w:t>
+      </w:r>
+      <w:r>
+        <w:rPr>
+          <w:rFonts w:ascii="Georgia" w:cs="Georgia" w:eastAsia="Georgia" w:hAnsi="Georgia"/>
+          <w:b/>
+          <w:bCs/>
+          <w:color w:val="1A2321"/>
+          <w:sz w:val="22"/>
+          <w:szCs w:val="22"/>
+        </w:rPr>
+        <w:t xml:space="preserve">ReverseBid</w:t>
+      </w:r>
+      <w:r>
+        <w:rPr>
+          <w:rFonts w:ascii="Georgia" w:cs="Georgia" w:eastAsia="Georgia" w:hAnsi="Georgia"/>
+          <w:color w:val="1A2321"/>
+          <w:sz w:val="22"/>
+          <w:szCs w:val="22"/>
+        </w:rPr>
+        <w:t xml:space="preserve">. That folder is the app.</w:t>
       </w:r>
     </w:p>
     <w:p>
@@ -1024,7 +1073,7 @@
           <w:sz w:val="22"/>
           <w:szCs w:val="22"/>
         </w:rPr>
-        <w:t xml:space="preserve">You should now be looking at a folder containing these, among others:</w:t>
+        <w:t xml:space="preserve">Directly inside that folder you should now see these, among others:</w:t>
       </w:r>
     </w:p>
     <w:p>
@@ -1061,7 +1110,26 @@
           <w:sz w:val="19"/>
           <w:szCs w:val="19"/>
         </w:rPr>
-        <w:t xml:space="preserve">C:\ReverseBid\ra\</w:t>
+        <w:t xml:space="preserve">C:\ReverseBid\</w:t>
+      </w:r>
+    </w:p>
+    <w:p>
+      <w:pPr>
+        <w:pBdr>
+          <w:left w:val="single" w:color="0C665F" w:sz="18" w:space="8"/>
+        </w:pBdr>
+        <w:shd w:fill="F1F3F5" w:val="clear"/>
+        <w:spacing w:after="0" w:before="0" w:line="280"/>
+        <w:ind w:left="200" w:right="200"/>
+      </w:pPr>
+      <w:r>
+        <w:rPr>
+          <w:rFonts w:ascii="Consolas" w:cs="Consolas" w:eastAsia="Consolas" w:hAnsi="Consolas"/>
+          <w:color w:val="1A2321"/>
+          <w:sz w:val="19"/>
+          <w:szCs w:val="19"/>
+        </w:rPr>
+        <w:t xml:space="preserve">    START HERE.txt</w:t>
       </w:r>
     </w:p>
     <w:p>
@@ -1139,6 +1207,60 @@
           <w:szCs w:val="19"/>
         </w:rPr>
         <w:t xml:space="preserve">    app\   docs\   tests\</w:t>
+      </w:r>
+    </w:p>
+    <w:p>
+      <w:pPr>
+        <w:pBdr>
+          <w:top w:val="single" w:color="FBF2E3" w:sz="2" w:space="8"/>
+          <w:bottom w:val="single" w:color="FBF2E3" w:sz="2" w:space="8"/>
+          <w:left w:val="single" w:color="8A5200" w:sz="18" w:space="8"/>
+          <w:right w:val="single" w:color="FBF2E3" w:sz="2" w:space="8"/>
+        </w:pBdr>
+        <w:shd w:fill="FBF2E3" w:val="clear"/>
+        <w:spacing w:after="220" w:before="120" w:line="300"/>
+        <w:ind w:left="160" w:right="160"/>
+      </w:pPr>
+      <w:r>
+        <w:rPr>
+          <w:rFonts w:ascii="Segoe UI" w:cs="Segoe UI" w:eastAsia="Segoe UI" w:hAnsi="Segoe UI"/>
+          <w:b/>
+          <w:bCs/>
+          <w:color w:val="8A5200"/>
+          <w:spacing w:val="20"/>
+          <w:sz w:val="16"/>
+          <w:szCs w:val="16"/>
+        </w:rPr>
+        <w:t xml:space="preserve">CANNOT SEE THOSE FILES?  </w:t>
+      </w:r>
+      <w:r>
+        <w:rPr>
+          <w:rFonts w:ascii="Georgia" w:cs="Georgia" w:eastAsia="Georgia" w:hAnsi="Georgia"/>
+          <w:color w:val="1A2321"/>
+          <w:sz w:val="21"/>
+          <w:szCs w:val="21"/>
+        </w:rPr>
+        <w:t xml:space="preserve">Then you are looking at the wrong folder. The correct one has </w:t>
+      </w:r>
+      <w:r>
+        <w:rPr>
+          <w:rFonts w:ascii="Georgia" w:cs="Georgia" w:eastAsia="Georgia" w:hAnsi="Georgia"/>
+          <w:b/>
+          <w:bCs/>
+          <w:color w:val="1A2321"/>
+          <w:sz w:val="21"/>
+          <w:szCs w:val="21"/>
+        </w:rPr>
+        <w:t xml:space="preserve">README.md</w:t>
+      </w:r>
+      <w:r>
+        <w:rPr>
+          <w:rFonts w:ascii="Georgia" w:cs="Georgia" w:eastAsia="Georgia" w:hAnsi="Georgia"/>
+          <w:color w:val="1A2321"/>
+          <w:sz w:val="21"/>
+          <w:szCs w:val="21"/>
+        </w:rPr>
+        <w:t xml:space="preserve"> sitting directly inside it. If you can see only one folder and nothing else, open that folder — the files are in there.</w:t>
       </w:r>
     </w:p>
     <w:p>
@@ -1544,7 +1666,7 @@
           <w:sz w:val="22"/>
           <w:szCs w:val="22"/>
         </w:rPr>
-        <w:t xml:space="preserve">C:\ReverseBid\ra</w:t>
+        <w:t xml:space="preserve">C:\ReverseBid</w:t>
       </w:r>
       <w:r>
         <w:rPr>
@@ -2827,7 +2949,7 @@
           <w:sz w:val="22"/>
           <w:szCs w:val="22"/>
         </w:rPr>
-        <w:t xml:space="preserve">C:\ReverseBid\ra\data</w:t>
+        <w:t xml:space="preserve">C:\ReverseBid\data</w:t>
       </w:r>
       <w:r>
         <w:rPr>
@@ -3154,7 +3276,7 @@
           <w:sz w:val="22"/>
           <w:szCs w:val="22"/>
         </w:rPr>
-        <w:t xml:space="preserve">C:\ReverseBid\ra</w:t>
+        <w:t xml:space="preserve">C:\ReverseBid</w:t>
       </w:r>
       <w:r>
         <w:rPr>
@@ -3949,7 +4071,7 @@
           <w:sz w:val="19"/>
           <w:szCs w:val="19"/>
         </w:rPr>
-        <w:t xml:space="preserve">cd /d C:\ReverseBid\ra</w:t>
+        <w:t xml:space="preserve">cd /d C:\ReverseBid</w:t>
       </w:r>
     </w:p>
     <w:p>
@@ -4034,7 +4156,7 @@
           <w:sz w:val="22"/>
           <w:szCs w:val="22"/>
         </w:rPr>
-        <w:t xml:space="preserve">C:\ReverseBid\ra</w:t>
+        <w:t xml:space="preserve">C:\ReverseBid</w:t>
       </w:r>
       <w:r>
         <w:rPr>
@@ -4588,7 +4710,7 @@
                 <w:szCs w:val="17"/>
                 <w:shd w:fill="F1F3F5" w:val="clear"/>
               </w:rPr>
-              <w:t xml:space="preserve">cd /d C:\ReverseBid\ra</w:t>
+              <w:t xml:space="preserve">cd /d C:\ReverseBid</w:t>
             </w:r>
             <w:r>
               <w:rPr>
@@ -4710,7 +4832,7 @@
                 <w:szCs w:val="17"/>
                 <w:shd w:fill="F1F3F5" w:val="clear"/>
               </w:rPr>
-              <w:t xml:space="preserve">cd /d C:\ReverseBid\ra</w:t>
+              <w:t xml:space="preserve">cd /d C:\ReverseBid</w:t>
             </w:r>
             <w:r>
               <w:rPr>
@@ -5231,7 +5353,7 @@
           <w:sz w:val="19"/>
           <w:szCs w:val="19"/>
         </w:rPr>
-        <w:t xml:space="preserve">cd /d C:\ReverseBid\ra</w:t>
+        <w:t xml:space="preserve">cd /d C:\ReverseBid</w:t>
       </w:r>
     </w:p>
     <w:p>

</xml_diff>